<commit_message>
Add corrected ad versions to BlueHackers evaluation
Include full rewritten versions of both ads after each T-table
analysis, demonstrating applied direct response copywriting
principles beyond what was requested.

Co-Authored-By: Claude Opus 4.6 <noreply@anthropic.com>
Claude-Session: https://claude.ai/code/session_01XyhqfmH114sHU8jizAj9nA
</commit_message>
<xml_diff>
--- a/BlueHackers_Evaluacion_Final_Marco.docx
+++ b/BlueHackers_Evaluacion_Final_Marco.docx
@@ -4415,6 +4415,351 @@
           <w:sz w:val="22"/>
           <w:szCs w:val="22"/>
         </w:rPr>
+        <w:t xml:space="preserve">Versión corregida — Anuncio 1</w:t>
+      </w:r>
+    </w:p>
+    <w:p>
+      <w:pPr>
+        <w:spacing w:after="160"/>
+        <w:jc w:val="left"/>
+      </w:pPr>
+      <w:r>
+        <w:rPr>
+          <w:rFonts w:ascii="Calibri" w:cs="Calibri" w:eastAsia="Calibri" w:hAnsi="Calibri"/>
+          <w:b w:val="false"/>
+          <w:bCs w:val="false"/>
+          <w:i/>
+          <w:iCs/>
+          <w:color w:val="6b7280"/>
+          <w:sz w:val="20"/>
+          <w:szCs w:val="20"/>
+        </w:rPr>
+        <w:t xml:space="preserve">A continuación, mi propuesta de reescritura aplicando los principios de respuesta directa:</w:t>
+      </w:r>
+    </w:p>
+    <w:p>
+      <w:pPr>
+        <w:spacing w:after="40"/>
+        <w:jc w:val="left"/>
+      </w:pPr>
+      <w:r>
+        <w:rPr>
+          <w:rFonts w:ascii="Calibri" w:cs="Calibri" w:eastAsia="Calibri" w:hAnsi="Calibri"/>
+          <w:b/>
+          <w:bCs/>
+          <w:i w:val="false"/>
+          <w:iCs w:val="false"/>
+          <w:color w:val="1F2937"/>
+          <w:sz w:val="21"/>
+          <w:szCs w:val="21"/>
+        </w:rPr>
+        <w:t xml:space="preserve">"El mes pasado cerré 7 clientes a $2,000 cada uno.</w:t>
+      </w:r>
+    </w:p>
+    <w:p>
+      <w:pPr>
+        <w:spacing w:after="160"/>
+        <w:jc w:val="left"/>
+      </w:pPr>
+      <w:r>
+        <w:rPr>
+          <w:rFonts w:ascii="Calibri" w:cs="Calibri" w:eastAsia="Calibri" w:hAnsi="Calibri"/>
+          <w:b/>
+          <w:bCs/>
+          <w:i w:val="false"/>
+          <w:iCs w:val="false"/>
+          <w:color w:val="1F2937"/>
+          <w:sz w:val="21"/>
+          <w:szCs w:val="21"/>
+        </w:rPr>
+        <w:t xml:space="preserve">Hace 6 meses no podía cerrar ni uno."</w:t>
+      </w:r>
+    </w:p>
+    <w:p>
+      <w:pPr>
+        <w:spacing w:after="100"/>
+        <w:jc w:val="left"/>
+      </w:pPr>
+      <w:r>
+        <w:rPr>
+          <w:rFonts w:ascii="Calibri" w:cs="Calibri" w:eastAsia="Calibri" w:hAnsi="Calibri"/>
+          <w:b w:val="false"/>
+          <w:bCs w:val="false"/>
+          <w:i w:val="false"/>
+          <w:iCs w:val="false"/>
+          <w:color w:val="1F2937"/>
+          <w:sz w:val="21"/>
+          <w:szCs w:val="21"/>
+        </w:rPr>
+        <w:t xml:space="preserve">Juan es coach de desarrollo personal. Tiene 3 años de experiencia, buenos testimonios y sabe que su método funciona.</w:t>
+      </w:r>
+    </w:p>
+    <w:p>
+      <w:pPr>
+        <w:spacing w:after="100"/>
+        <w:jc w:val="left"/>
+      </w:pPr>
+      <w:r>
+        <w:rPr>
+          <w:rFonts w:ascii="Calibri" w:cs="Calibri" w:eastAsia="Calibri" w:hAnsi="Calibri"/>
+          <w:b w:val="false"/>
+          <w:bCs w:val="false"/>
+          <w:i w:val="false"/>
+          <w:iCs w:val="false"/>
+          <w:color w:val="1F2937"/>
+          <w:sz w:val="21"/>
+          <w:szCs w:val="21"/>
+        </w:rPr>
+        <w:t xml:space="preserve">Pero vivía en la montaña rusa de ingresos: un mes facturaba $3,000, al siguiente $800. Sin sistema de captación, sin proceso de venta, sin predictibilidad.</w:t>
+      </w:r>
+    </w:p>
+    <w:p>
+      <w:pPr>
+        <w:spacing w:after="160"/>
+        <w:jc w:val="left"/>
+      </w:pPr>
+      <w:r>
+        <w:rPr>
+          <w:rFonts w:ascii="Calibri" w:cs="Calibri" w:eastAsia="Calibri" w:hAnsi="Calibri"/>
+          <w:b w:val="false"/>
+          <w:bCs w:val="false"/>
+          <w:i w:val="false"/>
+          <w:iCs w:val="false"/>
+          <w:color w:val="1F2937"/>
+          <w:sz w:val="21"/>
+          <w:szCs w:val="21"/>
+        </w:rPr>
+        <w:t xml:space="preserve">Su problema no era el coaching. Era que nadie sabía que existía.</w:t>
+      </w:r>
+    </w:p>
+    <w:p>
+      <w:pPr>
+        <w:spacing w:after="80"/>
+        <w:jc w:val="left"/>
+      </w:pPr>
+      <w:r>
+        <w:rPr>
+          <w:rFonts w:ascii="Calibri" w:cs="Calibri" w:eastAsia="Calibri" w:hAnsi="Calibri"/>
+          <w:b/>
+          <w:bCs/>
+          <w:i w:val="false"/>
+          <w:iCs w:val="false"/>
+          <w:color w:val="1F2937"/>
+          <w:sz w:val="21"/>
+          <w:szCs w:val="21"/>
+        </w:rPr>
+        <w:t xml:space="preserve">En 60 días implementamos tres cosas:</w:t>
+      </w:r>
+    </w:p>
+    <w:p>
+      <w:pPr>
+        <w:spacing w:after="40"/>
+        <w:jc w:val="left"/>
+      </w:pPr>
+      <w:r>
+        <w:rPr>
+          <w:rFonts w:ascii="Calibri" w:cs="Calibri" w:eastAsia="Calibri" w:hAnsi="Calibri"/>
+          <w:b w:val="false"/>
+          <w:bCs w:val="false"/>
+          <w:i w:val="false"/>
+          <w:iCs w:val="false"/>
+          <w:color w:val="1F2937"/>
+          <w:sz w:val="21"/>
+          <w:szCs w:val="21"/>
+        </w:rPr>
+        <w:t xml:space="preserve">1. Anuncios que atraen a su cliente ideal (coaches y consultores que facturan entre $2K-$8K/mes y quieren escalar).</w:t>
+      </w:r>
+    </w:p>
+    <w:p>
+      <w:pPr>
+        <w:spacing w:after="40"/>
+        <w:jc w:val="left"/>
+      </w:pPr>
+      <w:r>
+        <w:rPr>
+          <w:rFonts w:ascii="Calibri" w:cs="Calibri" w:eastAsia="Calibri" w:hAnsi="Calibri"/>
+          <w:b w:val="false"/>
+          <w:bCs w:val="false"/>
+          <w:i w:val="false"/>
+          <w:iCs w:val="false"/>
+          <w:color w:val="1F2937"/>
+          <w:sz w:val="21"/>
+          <w:szCs w:val="21"/>
+        </w:rPr>
+        <w:t xml:space="preserve">2. Un setter entrenado que filtra y agenda solo prospectos cualificados.</w:t>
+      </w:r>
+    </w:p>
+    <w:p>
+      <w:pPr>
+        <w:spacing w:after="160"/>
+        <w:jc w:val="left"/>
+      </w:pPr>
+      <w:r>
+        <w:rPr>
+          <w:rFonts w:ascii="Calibri" w:cs="Calibri" w:eastAsia="Calibri" w:hAnsi="Calibri"/>
+          <w:b w:val="false"/>
+          <w:bCs w:val="false"/>
+          <w:i w:val="false"/>
+          <w:iCs w:val="false"/>
+          <w:color w:val="1F2937"/>
+          <w:sz w:val="21"/>
+          <w:szCs w:val="21"/>
+        </w:rPr>
+        <w:t xml:space="preserve">3. Un proceso de venta que cierra sin presión y sin objeciones al final.</w:t>
+      </w:r>
+    </w:p>
+    <w:p>
+      <w:pPr>
+        <w:spacing w:after="160"/>
+        <w:jc w:val="left"/>
+      </w:pPr>
+      <w:r>
+        <w:rPr>
+          <w:rFonts w:ascii="Calibri" w:cs="Calibri" w:eastAsia="Calibri" w:hAnsi="Calibri"/>
+          <w:b/>
+          <w:bCs/>
+          <w:i w:val="false"/>
+          <w:iCs w:val="false"/>
+          <w:color w:val="166534"/>
+          <w:sz w:val="21"/>
+          <w:szCs w:val="21"/>
+        </w:rPr>
+        <w:t xml:space="preserve">Resultado: de $800/mes a $14,000/mes en 60 días. Sin trabajar más horas. Sin rogar por clientes.</w:t>
+      </w:r>
+    </w:p>
+    <w:p>
+      <w:pPr>
+        <w:spacing w:after="80"/>
+        <w:jc w:val="left"/>
+      </w:pPr>
+      <w:r>
+        <w:rPr>
+          <w:rFonts w:ascii="Calibri" w:cs="Calibri" w:eastAsia="Calibri" w:hAnsi="Calibri"/>
+          <w:b/>
+          <w:bCs/>
+          <w:i w:val="false"/>
+          <w:iCs w:val="false"/>
+          <w:color w:val="1F2937"/>
+          <w:sz w:val="21"/>
+          <w:szCs w:val="21"/>
+        </w:rPr>
+        <w:t xml:space="preserve">Este mes abrimos 3 espacios para coaches o consultores que:</w:t>
+      </w:r>
+    </w:p>
+    <w:p>
+      <w:pPr>
+        <w:spacing w:after="40"/>
+        <w:jc w:val="left"/>
+      </w:pPr>
+      <w:r>
+        <w:rPr>
+          <w:rFonts w:ascii="Calibri" w:cs="Calibri" w:eastAsia="Calibri" w:hAnsi="Calibri"/>
+          <w:b w:val="false"/>
+          <w:bCs w:val="false"/>
+          <w:i w:val="false"/>
+          <w:iCs w:val="false"/>
+          <w:color w:val="1F2937"/>
+          <w:sz w:val="21"/>
+          <w:szCs w:val="21"/>
+        </w:rPr>
+        <w:t xml:space="preserve">→ Ya tienen un método que funciona pero no generan clientes de forma predecible.</w:t>
+      </w:r>
+    </w:p>
+    <w:p>
+      <w:pPr>
+        <w:spacing w:after="40"/>
+        <w:jc w:val="left"/>
+      </w:pPr>
+      <w:r>
+        <w:rPr>
+          <w:rFonts w:ascii="Calibri" w:cs="Calibri" w:eastAsia="Calibri" w:hAnsi="Calibri"/>
+          <w:b w:val="false"/>
+          <w:bCs w:val="false"/>
+          <w:i w:val="false"/>
+          <w:iCs w:val="false"/>
+          <w:color w:val="1F2937"/>
+          <w:sz w:val="21"/>
+          <w:szCs w:val="21"/>
+        </w:rPr>
+        <w:t xml:space="preserve">→ Quieren facturar $10K+/mes sin depender de referidos o redes sociales orgánicas.</w:t>
+      </w:r>
+    </w:p>
+    <w:p>
+      <w:pPr>
+        <w:spacing w:after="160"/>
+        <w:jc w:val="left"/>
+      </w:pPr>
+      <w:r>
+        <w:rPr>
+          <w:rFonts w:ascii="Calibri" w:cs="Calibri" w:eastAsia="Calibri" w:hAnsi="Calibri"/>
+          <w:b w:val="false"/>
+          <w:bCs w:val="false"/>
+          <w:i w:val="false"/>
+          <w:iCs w:val="false"/>
+          <w:color w:val="1F2937"/>
+          <w:sz w:val="21"/>
+          <w:szCs w:val="21"/>
+        </w:rPr>
+        <w:t xml:space="preserve">→ Están dispuestos a invertir en un sistema, no en otro curso.</w:t>
+      </w:r>
+    </w:p>
+    <w:p>
+      <w:pPr>
+        <w:spacing w:after="100"/>
+        <w:jc w:val="left"/>
+      </w:pPr>
+      <w:r>
+        <w:rPr>
+          <w:rFonts w:ascii="Calibri" w:cs="Calibri" w:eastAsia="Calibri" w:hAnsi="Calibri"/>
+          <w:b w:val="false"/>
+          <w:bCs w:val="false"/>
+          <w:i w:val="false"/>
+          <w:iCs w:val="false"/>
+          <w:color w:val="1F2937"/>
+          <w:sz w:val="21"/>
+          <w:szCs w:val="21"/>
+        </w:rPr>
+        <w:t xml:space="preserve">Si eso te describe, comenta "SISTEMA" o haz clic en el enlace para agendar una sesión de diagnóstico gratuita de 30 minutos donde analizamos tu situación y te damos un plan concreto.</w:t>
+      </w:r>
+    </w:p>
+    <w:p>
+      <w:pPr>
+        <w:spacing w:after="200"/>
+        <w:jc w:val="left"/>
+      </w:pPr>
+      <w:r>
+        <w:rPr>
+          <w:rFonts w:ascii="Calibri" w:cs="Calibri" w:eastAsia="Calibri" w:hAnsi="Calibri"/>
+          <w:b w:val="false"/>
+          <w:bCs w:val="false"/>
+          <w:i/>
+          <w:iCs/>
+          <w:color w:val="1F2937"/>
+          <w:sz w:val="21"/>
+          <w:szCs w:val="21"/>
+        </w:rPr>
+        <w:t xml:space="preserve">Sin compromiso. Si no es para ti, te lo decimos.</w:t>
+      </w:r>
+    </w:p>
+    <w:p>
+      <w:pPr>
+        <w:spacing w:after="200"/>
+      </w:pPr>
+    </w:p>
+    <w:p>
+      <w:pPr>
+        <w:pStyle w:val="Heading3"/>
+        <w:spacing w:after="120" w:before="300"/>
+      </w:pPr>
+      <w:r>
+        <w:rPr>
+          <w:rFonts w:ascii="Calibri" w:cs="Calibri" w:eastAsia="Calibri" w:hAnsi="Calibri"/>
+          <w:b/>
+          <w:bCs/>
+          <w:color w:val="334470"/>
+          <w:sz w:val="22"/>
+          <w:szCs w:val="22"/>
+        </w:rPr>
         <w:t xml:space="preserve">Anuncio 2</w:t>
       </w:r>
     </w:p>
@@ -4753,6 +5098,294 @@
         </w:tc>
       </w:tr>
     </w:tbl>
+    <w:p>
+      <w:pPr>
+        <w:spacing w:after="200"/>
+      </w:pPr>
+    </w:p>
+    <w:p>
+      <w:pPr>
+        <w:pStyle w:val="Heading3"/>
+        <w:spacing w:after="120" w:before="300"/>
+      </w:pPr>
+      <w:r>
+        <w:rPr>
+          <w:rFonts w:ascii="Calibri" w:cs="Calibri" w:eastAsia="Calibri" w:hAnsi="Calibri"/>
+          <w:b/>
+          <w:bCs/>
+          <w:color w:val="334470"/>
+          <w:sz w:val="22"/>
+          <w:szCs w:val="22"/>
+        </w:rPr>
+        <w:t xml:space="preserve">Versión corregida — Anuncio 2</w:t>
+      </w:r>
+    </w:p>
+    <w:p>
+      <w:pPr>
+        <w:spacing w:after="160"/>
+        <w:jc w:val="left"/>
+      </w:pPr>
+      <w:r>
+        <w:rPr>
+          <w:rFonts w:ascii="Calibri" w:cs="Calibri" w:eastAsia="Calibri" w:hAnsi="Calibri"/>
+          <w:b w:val="false"/>
+          <w:bCs w:val="false"/>
+          <w:i/>
+          <w:iCs/>
+          <w:color w:val="6b7280"/>
+          <w:sz w:val="20"/>
+          <w:szCs w:val="20"/>
+        </w:rPr>
+        <w:t xml:space="preserve">Reescritura aplicando: un avatar, un problema, un resultado con prueba social:</w:t>
+      </w:r>
+    </w:p>
+    <w:p>
+      <w:pPr>
+        <w:spacing w:after="160"/>
+        <w:jc w:val="left"/>
+      </w:pPr>
+      <w:r>
+        <w:rPr>
+          <w:rFonts w:ascii="Calibri" w:cs="Calibri" w:eastAsia="Calibri" w:hAnsi="Calibri"/>
+          <w:b/>
+          <w:bCs/>
+          <w:i w:val="false"/>
+          <w:iCs w:val="false"/>
+          <w:color w:val="1F2937"/>
+          <w:sz w:val="21"/>
+          <w:szCs w:val="21"/>
+        </w:rPr>
+        <w:t xml:space="preserve">"Trabajaba 14 horas al día, no dormía y estaba a punto de renunciar a mi propia empresa."</w:t>
+      </w:r>
+    </w:p>
+    <w:p>
+      <w:pPr>
+        <w:spacing w:after="100"/>
+        <w:jc w:val="left"/>
+      </w:pPr>
+      <w:r>
+        <w:rPr>
+          <w:rFonts w:ascii="Calibri" w:cs="Calibri" w:eastAsia="Calibri" w:hAnsi="Calibri"/>
+          <w:b w:val="false"/>
+          <w:bCs w:val="false"/>
+          <w:i w:val="false"/>
+          <w:iCs w:val="false"/>
+          <w:color w:val="1F2937"/>
+          <w:sz w:val="21"/>
+          <w:szCs w:val="21"/>
+        </w:rPr>
+        <w:t xml:space="preserve">Carlos tiene una agencia de marketing con 12 empleados. Desde fuera, todo iba bien: facturación creciendo, equipo completo, clientes contentos.</w:t>
+      </w:r>
+    </w:p>
+    <w:p>
+      <w:pPr>
+        <w:spacing w:after="100"/>
+        <w:jc w:val="left"/>
+      </w:pPr>
+      <w:r>
+        <w:rPr>
+          <w:rFonts w:ascii="Calibri" w:cs="Calibri" w:eastAsia="Calibri" w:hAnsi="Calibri"/>
+          <w:b w:val="false"/>
+          <w:bCs w:val="false"/>
+          <w:i w:val="false"/>
+          <w:iCs w:val="false"/>
+          <w:color w:val="1F2937"/>
+          <w:sz w:val="21"/>
+          <w:szCs w:val="21"/>
+        </w:rPr>
+        <w:t xml:space="preserve">Desde dentro, era un desastre. Cada decisión pasaba por él. Apagaba fuegos 14 horas al día. No podía irse de vacaciones sin que algo explotara.</w:t>
+      </w:r>
+    </w:p>
+    <w:p>
+      <w:pPr>
+        <w:spacing w:after="160"/>
+        <w:jc w:val="left"/>
+      </w:pPr>
+      <w:r>
+        <w:rPr>
+          <w:rFonts w:ascii="Calibri" w:cs="Calibri" w:eastAsia="Calibri" w:hAnsi="Calibri"/>
+          <w:b w:val="false"/>
+          <w:bCs w:val="false"/>
+          <w:i w:val="false"/>
+          <w:iCs w:val="false"/>
+          <w:color w:val="1F2937"/>
+          <w:sz w:val="21"/>
+          <w:szCs w:val="21"/>
+        </w:rPr>
+        <w:t xml:space="preserve">Tenía un negocio que funcionaba, pero solo si él estaba encima de todo. No era un CEO — era el empleado más caro de su propia empresa.</w:t>
+      </w:r>
+    </w:p>
+    <w:p>
+      <w:pPr>
+        <w:spacing w:after="80"/>
+        <w:jc w:val="left"/>
+      </w:pPr>
+      <w:r>
+        <w:rPr>
+          <w:rFonts w:ascii="Calibri" w:cs="Calibri" w:eastAsia="Calibri" w:hAnsi="Calibri"/>
+          <w:b/>
+          <w:bCs/>
+          <w:i w:val="false"/>
+          <w:iCs w:val="false"/>
+          <w:color w:val="1F2937"/>
+          <w:sz w:val="21"/>
+          <w:szCs w:val="21"/>
+        </w:rPr>
+        <w:t xml:space="preserve">En 8 semanas cambiamos 3 cosas:</w:t>
+      </w:r>
+    </w:p>
+    <w:p>
+      <w:pPr>
+        <w:spacing w:after="40"/>
+        <w:jc w:val="left"/>
+      </w:pPr>
+      <w:r>
+        <w:rPr>
+          <w:rFonts w:ascii="Calibri" w:cs="Calibri" w:eastAsia="Calibri" w:hAnsi="Calibri"/>
+          <w:b w:val="false"/>
+          <w:bCs w:val="false"/>
+          <w:i w:val="false"/>
+          <w:iCs w:val="false"/>
+          <w:color w:val="1F2937"/>
+          <w:sz w:val="21"/>
+          <w:szCs w:val="21"/>
+        </w:rPr>
+        <w:t xml:space="preserve">1. Delegó el 60% de las decisiones operativas con un framework de autonomía por niveles.</w:t>
+      </w:r>
+    </w:p>
+    <w:p>
+      <w:pPr>
+        <w:spacing w:after="40"/>
+        <w:jc w:val="left"/>
+      </w:pPr>
+      <w:r>
+        <w:rPr>
+          <w:rFonts w:ascii="Calibri" w:cs="Calibri" w:eastAsia="Calibri" w:hAnsi="Calibri"/>
+          <w:b w:val="false"/>
+          <w:bCs w:val="false"/>
+          <w:i w:val="false"/>
+          <w:iCs w:val="false"/>
+          <w:color w:val="1F2937"/>
+          <w:sz w:val="21"/>
+          <w:szCs w:val="21"/>
+        </w:rPr>
+        <w:t xml:space="preserve">2. Instaló un sistema de toma de decisiones que su equipo usa sin consultarle.</w:t>
+      </w:r>
+    </w:p>
+    <w:p>
+      <w:pPr>
+        <w:spacing w:after="160"/>
+        <w:jc w:val="left"/>
+      </w:pPr>
+      <w:r>
+        <w:rPr>
+          <w:rFonts w:ascii="Calibri" w:cs="Calibri" w:eastAsia="Calibri" w:hAnsi="Calibri"/>
+          <w:b w:val="false"/>
+          <w:bCs w:val="false"/>
+          <w:i w:val="false"/>
+          <w:iCs w:val="false"/>
+          <w:color w:val="1F2937"/>
+          <w:sz w:val="21"/>
+          <w:szCs w:val="21"/>
+        </w:rPr>
+        <w:t xml:space="preserve">3. Recuperó sus noches, sus fines de semana y su relación de pareja.</w:t>
+      </w:r>
+    </w:p>
+    <w:p>
+      <w:pPr>
+        <w:spacing w:after="160"/>
+        <w:jc w:val="left"/>
+      </w:pPr>
+      <w:r>
+        <w:rPr>
+          <w:rFonts w:ascii="Calibri" w:cs="Calibri" w:eastAsia="Calibri" w:hAnsi="Calibri"/>
+          <w:b/>
+          <w:bCs/>
+          <w:i w:val="false"/>
+          <w:iCs w:val="false"/>
+          <w:color w:val="166534"/>
+          <w:sz w:val="21"/>
+          <w:szCs w:val="21"/>
+        </w:rPr>
+        <w:t xml:space="preserve">Hoy factura lo mismo, trabaja 6 horas al día y su equipo rinde mejor que cuando él controlaba todo.</w:t>
+      </w:r>
+    </w:p>
+    <w:p>
+      <w:pPr>
+        <w:spacing w:after="100"/>
+        <w:jc w:val="left"/>
+      </w:pPr>
+      <w:r>
+        <w:rPr>
+          <w:rFonts w:ascii="Calibri" w:cs="Calibri" w:eastAsia="Calibri" w:hAnsi="Calibri"/>
+          <w:b/>
+          <w:bCs/>
+          <w:i w:val="false"/>
+          <w:iCs w:val="false"/>
+          <w:color w:val="1F2937"/>
+          <w:sz w:val="21"/>
+          <w:szCs w:val="21"/>
+        </w:rPr>
+        <w:t xml:space="preserve">Si tienes un negocio que funciona pero te consume la vida, esto es para ti.</w:t>
+      </w:r>
+    </w:p>
+    <w:p>
+      <w:pPr>
+        <w:spacing w:after="160"/>
+        <w:jc w:val="left"/>
+      </w:pPr>
+      <w:r>
+        <w:rPr>
+          <w:rFonts w:ascii="Calibri" w:cs="Calibri" w:eastAsia="Calibri" w:hAnsi="Calibri"/>
+          <w:b w:val="false"/>
+          <w:bCs w:val="false"/>
+          <w:i w:val="false"/>
+          <w:iCs w:val="false"/>
+          <w:color w:val="1F2937"/>
+          <w:sz w:val="21"/>
+          <w:szCs w:val="21"/>
+        </w:rPr>
+        <w:t xml:space="preserve">No es otro curso de liderazgo. Es un proceso de 8 semanas donde reestructuramos cómo opera tu negocio para que deje de depender de ti para respirar.</w:t>
+      </w:r>
+    </w:p>
+    <w:p>
+      <w:pPr>
+        <w:spacing w:after="100"/>
+        <w:jc w:val="left"/>
+      </w:pPr>
+      <w:r>
+        <w:rPr>
+          <w:rFonts w:ascii="Calibri" w:cs="Calibri" w:eastAsia="Calibri" w:hAnsi="Calibri"/>
+          <w:b w:val="false"/>
+          <w:bCs w:val="false"/>
+          <w:i w:val="false"/>
+          <w:iCs w:val="false"/>
+          <w:color w:val="1F2937"/>
+          <w:sz w:val="21"/>
+          <w:szCs w:val="21"/>
+        </w:rPr>
+        <w:t xml:space="preserve">Abrimos 5 espacios este mes para dueños de negocio que facturen $15K+/mes y quieran dejar de ser el cuello de botella.</w:t>
+      </w:r>
+    </w:p>
+    <w:p>
+      <w:pPr>
+        <w:spacing w:after="100"/>
+        <w:jc w:val="left"/>
+      </w:pPr>
+      <w:r>
+        <w:rPr>
+          <w:rFonts w:ascii="Calibri" w:cs="Calibri" w:eastAsia="Calibri" w:hAnsi="Calibri"/>
+          <w:b w:val="false"/>
+          <w:bCs w:val="false"/>
+          <w:i w:val="false"/>
+          <w:iCs w:val="false"/>
+          <w:color w:val="1F2937"/>
+          <w:sz w:val="21"/>
+          <w:szCs w:val="21"/>
+        </w:rPr>
+        <w:t xml:space="preserve">Haz clic abajo para agendar un diagnóstico gratuito de 30 min. Si no aplica para ti, te lo decimos en los primeros 5 minutos.</w:t>
+      </w:r>
+    </w:p>
     <w:sectPr>
       <w:pgSz w:w="12240" w:h="15840" w:orient="portrait"/>
       <w:pgMar w:top="1200" w:right="1400" w:bottom="1200" w:left="1400" w:header="708" w:footer="708" w:gutter="0"/>

</xml_diff>

<commit_message>
Fix Ad 1 corrected version to match original niche
The original ad is about personal development — the corrected
version now stays in that niche (professional feeling stuck/on
autopilot) instead of pivoting to client acquisition for coaches.

Co-Authored-By: Claude Opus 4.6 <noreply@anthropic.com>
Claude-Session: https://claude.ai/code/session_01XyhqfmH114sHU8jizAj9nA
</commit_message>
<xml_diff>
--- a/BlueHackers_Evaluacion_Final_Marco.docx
+++ b/BlueHackers_Evaluacion_Final_Marco.docx
@@ -4439,21 +4439,135 @@
     </w:p>
     <w:p>
       <w:pPr>
+        <w:spacing w:after="160"/>
+        <w:jc w:val="left"/>
+      </w:pPr>
+      <w:r>
+        <w:rPr>
+          <w:rFonts w:ascii="Calibri" w:cs="Calibri" w:eastAsia="Calibri" w:hAnsi="Calibri"/>
+          <w:b/>
+          <w:bCs/>
+          <w:i w:val="false"/>
+          <w:iCs w:val="false"/>
+          <w:color w:val="1F2937"/>
+          <w:sz w:val="21"/>
+          <w:szCs w:val="21"/>
+        </w:rPr>
+        <w:t xml:space="preserve">"Hace 4 meses me despertaba a las 3 AM con el pecho apretado, pensando en todo lo que no estaba funcionando en mi vida."</w:t>
+      </w:r>
+    </w:p>
+    <w:p>
+      <w:pPr>
+        <w:spacing w:after="100"/>
+        <w:jc w:val="left"/>
+      </w:pPr>
+      <w:r>
+        <w:rPr>
+          <w:rFonts w:ascii="Calibri" w:cs="Calibri" w:eastAsia="Calibri" w:hAnsi="Calibri"/>
+          <w:b w:val="false"/>
+          <w:bCs w:val="false"/>
+          <w:i w:val="false"/>
+          <w:iCs w:val="false"/>
+          <w:color w:val="1F2937"/>
+          <w:sz w:val="21"/>
+          <w:szCs w:val="21"/>
+        </w:rPr>
+        <w:t xml:space="preserve">Andrea tiene 34 años. Desde fuera parecía que estaba bien: trabajo estable, pareja, rutina. Pero por dentro sentía que estaba en piloto automático. Sin energía. Sin dirección. Cada domingo en la noche, la misma angustia de empezar otra semana exactamente igual.</w:t>
+      </w:r>
+    </w:p>
+    <w:p>
+      <w:pPr>
+        <w:spacing w:after="100"/>
+        <w:jc w:val="left"/>
+      </w:pPr>
+      <w:r>
+        <w:rPr>
+          <w:rFonts w:ascii="Calibri" w:cs="Calibri" w:eastAsia="Calibri" w:hAnsi="Calibri"/>
+          <w:b w:val="false"/>
+          <w:bCs w:val="false"/>
+          <w:i w:val="false"/>
+          <w:iCs w:val="false"/>
+          <w:color w:val="1F2937"/>
+          <w:sz w:val="21"/>
+          <w:szCs w:val="21"/>
+        </w:rPr>
+        <w:t xml:space="preserve">Ya había probado de todo: libros de autoayuda, meditación con apps, journaling, un par de cursos online. Nada le duraba más de 2 semanas.</w:t>
+      </w:r>
+    </w:p>
+    <w:p>
+      <w:pPr>
+        <w:spacing w:after="160"/>
+        <w:jc w:val="left"/>
+      </w:pPr>
+      <w:r>
+        <w:rPr>
+          <w:rFonts w:ascii="Calibri" w:cs="Calibri" w:eastAsia="Calibri" w:hAnsi="Calibri"/>
+          <w:b w:val="false"/>
+          <w:bCs w:val="false"/>
+          <w:i w:val="false"/>
+          <w:iCs w:val="false"/>
+          <w:color w:val="1F2937"/>
+          <w:sz w:val="21"/>
+          <w:szCs w:val="21"/>
+        </w:rPr>
+        <w:t xml:space="preserve">Su problema no era falta de motivación. Era que no tenía un sistema real de cambio con alguien que la acompañara y le exigiera.</w:t>
+      </w:r>
+    </w:p>
+    <w:p>
+      <w:pPr>
+        <w:spacing w:after="80"/>
+        <w:jc w:val="left"/>
+      </w:pPr>
+      <w:r>
+        <w:rPr>
+          <w:rFonts w:ascii="Calibri" w:cs="Calibri" w:eastAsia="Calibri" w:hAnsi="Calibri"/>
+          <w:b/>
+          <w:bCs/>
+          <w:i w:val="false"/>
+          <w:iCs w:val="false"/>
+          <w:color w:val="1F2937"/>
+          <w:sz w:val="21"/>
+          <w:szCs w:val="21"/>
+        </w:rPr>
+        <w:t xml:space="preserve">En 90 días trabajamos en 3 áreas:</w:t>
+      </w:r>
+    </w:p>
+    <w:p>
+      <w:pPr>
         <w:spacing w:after="40"/>
         <w:jc w:val="left"/>
       </w:pPr>
       <w:r>
         <w:rPr>
           <w:rFonts w:ascii="Calibri" w:cs="Calibri" w:eastAsia="Calibri" w:hAnsi="Calibri"/>
-          <w:b/>
-          <w:bCs/>
-          <w:i w:val="false"/>
-          <w:iCs w:val="false"/>
-          <w:color w:val="1F2937"/>
-          <w:sz w:val="21"/>
-          <w:szCs w:val="21"/>
-        </w:rPr>
-        <w:t xml:space="preserve">"El mes pasado cerré 7 clientes a $2,000 cada uno.</w:t>
+          <w:b w:val="false"/>
+          <w:bCs w:val="false"/>
+          <w:i w:val="false"/>
+          <w:iCs w:val="false"/>
+          <w:color w:val="1F2937"/>
+          <w:sz w:val="21"/>
+          <w:szCs w:val="21"/>
+        </w:rPr>
+        <w:t xml:space="preserve">1. Claridad: definimos qué vida quería realmente (no la que "debería" querer) y eliminamos 4 compromisos que le drenaban energía.</w:t>
+      </w:r>
+    </w:p>
+    <w:p>
+      <w:pPr>
+        <w:spacing w:after="40"/>
+        <w:jc w:val="left"/>
+      </w:pPr>
+      <w:r>
+        <w:rPr>
+          <w:rFonts w:ascii="Calibri" w:cs="Calibri" w:eastAsia="Calibri" w:hAnsi="Calibri"/>
+          <w:b w:val="false"/>
+          <w:bCs w:val="false"/>
+          <w:i w:val="false"/>
+          <w:iCs w:val="false"/>
+          <w:color w:val="1F2937"/>
+          <w:sz w:val="21"/>
+          <w:szCs w:val="21"/>
+        </w:rPr>
+        <w:t xml:space="preserve">2. Estructura: instalamos una rutina de alto rendimiento personal adaptada a SU vida, no sacada de un libro genérico.</w:t>
       </w:r>
     </w:p>
     <w:p>
@@ -4464,15 +4578,110 @@
       <w:r>
         <w:rPr>
           <w:rFonts w:ascii="Calibri" w:cs="Calibri" w:eastAsia="Calibri" w:hAnsi="Calibri"/>
-          <w:b/>
-          <w:bCs/>
-          <w:i w:val="false"/>
-          <w:iCs w:val="false"/>
-          <w:color w:val="1F2937"/>
-          <w:sz w:val="21"/>
-          <w:szCs w:val="21"/>
-        </w:rPr>
-        <w:t xml:space="preserve">Hace 6 meses no podía cerrar ni uno."</w:t>
+          <w:b w:val="false"/>
+          <w:bCs w:val="false"/>
+          <w:i w:val="false"/>
+          <w:iCs w:val="false"/>
+          <w:color w:val="1F2937"/>
+          <w:sz w:val="21"/>
+          <w:szCs w:val="21"/>
+        </w:rPr>
+        <w:t xml:space="preserve">3. Accountability semanal: sesiones 1-a-1 donde no hay dónde esconderse. Reporta, revisa, ajusta.</w:t>
+      </w:r>
+    </w:p>
+    <w:p>
+      <w:pPr>
+        <w:spacing w:after="160"/>
+        <w:jc w:val="left"/>
+      </w:pPr>
+      <w:r>
+        <w:rPr>
+          <w:rFonts w:ascii="Calibri" w:cs="Calibri" w:eastAsia="Calibri" w:hAnsi="Calibri"/>
+          <w:b/>
+          <w:bCs/>
+          <w:i w:val="false"/>
+          <w:iCs w:val="false"/>
+          <w:color w:val="166534"/>
+          <w:sz w:val="21"/>
+          <w:szCs w:val="21"/>
+        </w:rPr>
+        <w:t xml:space="preserve">Resultado: dejó un trabajo que la hacía infeliz, negoció una posición con 40% más de salario en algo que le importa, y por primera vez en 3 años duerme sin pastillas.</w:t>
+      </w:r>
+    </w:p>
+    <w:p>
+      <w:pPr>
+        <w:spacing w:after="80"/>
+        <w:jc w:val="left"/>
+      </w:pPr>
+      <w:r>
+        <w:rPr>
+          <w:rFonts w:ascii="Calibri" w:cs="Calibri" w:eastAsia="Calibri" w:hAnsi="Calibri"/>
+          <w:b/>
+          <w:bCs/>
+          <w:i w:val="false"/>
+          <w:iCs w:val="false"/>
+          <w:color w:val="1F2937"/>
+          <w:sz w:val="21"/>
+          <w:szCs w:val="21"/>
+        </w:rPr>
+        <w:t xml:space="preserve">Este mes abrimos 5 espacios para profesionales de 28-45 años que:</w:t>
+      </w:r>
+    </w:p>
+    <w:p>
+      <w:pPr>
+        <w:spacing w:after="40"/>
+        <w:jc w:val="left"/>
+      </w:pPr>
+      <w:r>
+        <w:rPr>
+          <w:rFonts w:ascii="Calibri" w:cs="Calibri" w:eastAsia="Calibri" w:hAnsi="Calibri"/>
+          <w:b w:val="false"/>
+          <w:bCs w:val="false"/>
+          <w:i w:val="false"/>
+          <w:iCs w:val="false"/>
+          <w:color w:val="1F2937"/>
+          <w:sz w:val="21"/>
+          <w:szCs w:val="21"/>
+        </w:rPr>
+        <w:t xml:space="preserve">→ Sienten que su vida "funciona" pero no les llena.</w:t>
+      </w:r>
+    </w:p>
+    <w:p>
+      <w:pPr>
+        <w:spacing w:after="40"/>
+        <w:jc w:val="left"/>
+      </w:pPr>
+      <w:r>
+        <w:rPr>
+          <w:rFonts w:ascii="Calibri" w:cs="Calibri" w:eastAsia="Calibri" w:hAnsi="Calibri"/>
+          <w:b w:val="false"/>
+          <w:bCs w:val="false"/>
+          <w:i w:val="false"/>
+          <w:iCs w:val="false"/>
+          <w:color w:val="1F2937"/>
+          <w:sz w:val="21"/>
+          <w:szCs w:val="21"/>
+        </w:rPr>
+        <w:t xml:space="preserve">→ Ya probaron hacerlo solos y no les duró.</w:t>
+      </w:r>
+    </w:p>
+    <w:p>
+      <w:pPr>
+        <w:spacing w:after="160"/>
+        <w:jc w:val="left"/>
+      </w:pPr>
+      <w:r>
+        <w:rPr>
+          <w:rFonts w:ascii="Calibri" w:cs="Calibri" w:eastAsia="Calibri" w:hAnsi="Calibri"/>
+          <w:b w:val="false"/>
+          <w:bCs w:val="false"/>
+          <w:i w:val="false"/>
+          <w:iCs w:val="false"/>
+          <w:color w:val="1F2937"/>
+          <w:sz w:val="21"/>
+          <w:szCs w:val="21"/>
+        </w:rPr>
+        <w:t xml:space="preserve">→ Quieren resultados reales en 90 días, no frases bonitas.</w:t>
       </w:r>
     </w:p>
     <w:p>
@@ -4491,235 +4700,7 @@
           <w:sz w:val="21"/>
           <w:szCs w:val="21"/>
         </w:rPr>
-        <w:t xml:space="preserve">Juan es coach de desarrollo personal. Tiene 3 años de experiencia, buenos testimonios y sabe que su método funciona.</w:t>
-      </w:r>
-    </w:p>
-    <w:p>
-      <w:pPr>
-        <w:spacing w:after="100"/>
-        <w:jc w:val="left"/>
-      </w:pPr>
-      <w:r>
-        <w:rPr>
-          <w:rFonts w:ascii="Calibri" w:cs="Calibri" w:eastAsia="Calibri" w:hAnsi="Calibri"/>
-          <w:b w:val="false"/>
-          <w:bCs w:val="false"/>
-          <w:i w:val="false"/>
-          <w:iCs w:val="false"/>
-          <w:color w:val="1F2937"/>
-          <w:sz w:val="21"/>
-          <w:szCs w:val="21"/>
-        </w:rPr>
-        <w:t xml:space="preserve">Pero vivía en la montaña rusa de ingresos: un mes facturaba $3,000, al siguiente $800. Sin sistema de captación, sin proceso de venta, sin predictibilidad.</w:t>
-      </w:r>
-    </w:p>
-    <w:p>
-      <w:pPr>
-        <w:spacing w:after="160"/>
-        <w:jc w:val="left"/>
-      </w:pPr>
-      <w:r>
-        <w:rPr>
-          <w:rFonts w:ascii="Calibri" w:cs="Calibri" w:eastAsia="Calibri" w:hAnsi="Calibri"/>
-          <w:b w:val="false"/>
-          <w:bCs w:val="false"/>
-          <w:i w:val="false"/>
-          <w:iCs w:val="false"/>
-          <w:color w:val="1F2937"/>
-          <w:sz w:val="21"/>
-          <w:szCs w:val="21"/>
-        </w:rPr>
-        <w:t xml:space="preserve">Su problema no era el coaching. Era que nadie sabía que existía.</w:t>
-      </w:r>
-    </w:p>
-    <w:p>
-      <w:pPr>
-        <w:spacing w:after="80"/>
-        <w:jc w:val="left"/>
-      </w:pPr>
-      <w:r>
-        <w:rPr>
-          <w:rFonts w:ascii="Calibri" w:cs="Calibri" w:eastAsia="Calibri" w:hAnsi="Calibri"/>
-          <w:b/>
-          <w:bCs/>
-          <w:i w:val="false"/>
-          <w:iCs w:val="false"/>
-          <w:color w:val="1F2937"/>
-          <w:sz w:val="21"/>
-          <w:szCs w:val="21"/>
-        </w:rPr>
-        <w:t xml:space="preserve">En 60 días implementamos tres cosas:</w:t>
-      </w:r>
-    </w:p>
-    <w:p>
-      <w:pPr>
-        <w:spacing w:after="40"/>
-        <w:jc w:val="left"/>
-      </w:pPr>
-      <w:r>
-        <w:rPr>
-          <w:rFonts w:ascii="Calibri" w:cs="Calibri" w:eastAsia="Calibri" w:hAnsi="Calibri"/>
-          <w:b w:val="false"/>
-          <w:bCs w:val="false"/>
-          <w:i w:val="false"/>
-          <w:iCs w:val="false"/>
-          <w:color w:val="1F2937"/>
-          <w:sz w:val="21"/>
-          <w:szCs w:val="21"/>
-        </w:rPr>
-        <w:t xml:space="preserve">1. Anuncios que atraen a su cliente ideal (coaches y consultores que facturan entre $2K-$8K/mes y quieren escalar).</w:t>
-      </w:r>
-    </w:p>
-    <w:p>
-      <w:pPr>
-        <w:spacing w:after="40"/>
-        <w:jc w:val="left"/>
-      </w:pPr>
-      <w:r>
-        <w:rPr>
-          <w:rFonts w:ascii="Calibri" w:cs="Calibri" w:eastAsia="Calibri" w:hAnsi="Calibri"/>
-          <w:b w:val="false"/>
-          <w:bCs w:val="false"/>
-          <w:i w:val="false"/>
-          <w:iCs w:val="false"/>
-          <w:color w:val="1F2937"/>
-          <w:sz w:val="21"/>
-          <w:szCs w:val="21"/>
-        </w:rPr>
-        <w:t xml:space="preserve">2. Un setter entrenado que filtra y agenda solo prospectos cualificados.</w:t>
-      </w:r>
-    </w:p>
-    <w:p>
-      <w:pPr>
-        <w:spacing w:after="160"/>
-        <w:jc w:val="left"/>
-      </w:pPr>
-      <w:r>
-        <w:rPr>
-          <w:rFonts w:ascii="Calibri" w:cs="Calibri" w:eastAsia="Calibri" w:hAnsi="Calibri"/>
-          <w:b w:val="false"/>
-          <w:bCs w:val="false"/>
-          <w:i w:val="false"/>
-          <w:iCs w:val="false"/>
-          <w:color w:val="1F2937"/>
-          <w:sz w:val="21"/>
-          <w:szCs w:val="21"/>
-        </w:rPr>
-        <w:t xml:space="preserve">3. Un proceso de venta que cierra sin presión y sin objeciones al final.</w:t>
-      </w:r>
-    </w:p>
-    <w:p>
-      <w:pPr>
-        <w:spacing w:after="160"/>
-        <w:jc w:val="left"/>
-      </w:pPr>
-      <w:r>
-        <w:rPr>
-          <w:rFonts w:ascii="Calibri" w:cs="Calibri" w:eastAsia="Calibri" w:hAnsi="Calibri"/>
-          <w:b/>
-          <w:bCs/>
-          <w:i w:val="false"/>
-          <w:iCs w:val="false"/>
-          <w:color w:val="166534"/>
-          <w:sz w:val="21"/>
-          <w:szCs w:val="21"/>
-        </w:rPr>
-        <w:t xml:space="preserve">Resultado: de $800/mes a $14,000/mes en 60 días. Sin trabajar más horas. Sin rogar por clientes.</w:t>
-      </w:r>
-    </w:p>
-    <w:p>
-      <w:pPr>
-        <w:spacing w:after="80"/>
-        <w:jc w:val="left"/>
-      </w:pPr>
-      <w:r>
-        <w:rPr>
-          <w:rFonts w:ascii="Calibri" w:cs="Calibri" w:eastAsia="Calibri" w:hAnsi="Calibri"/>
-          <w:b/>
-          <w:bCs/>
-          <w:i w:val="false"/>
-          <w:iCs w:val="false"/>
-          <w:color w:val="1F2937"/>
-          <w:sz w:val="21"/>
-          <w:szCs w:val="21"/>
-        </w:rPr>
-        <w:t xml:space="preserve">Este mes abrimos 3 espacios para coaches o consultores que:</w:t>
-      </w:r>
-    </w:p>
-    <w:p>
-      <w:pPr>
-        <w:spacing w:after="40"/>
-        <w:jc w:val="left"/>
-      </w:pPr>
-      <w:r>
-        <w:rPr>
-          <w:rFonts w:ascii="Calibri" w:cs="Calibri" w:eastAsia="Calibri" w:hAnsi="Calibri"/>
-          <w:b w:val="false"/>
-          <w:bCs w:val="false"/>
-          <w:i w:val="false"/>
-          <w:iCs w:val="false"/>
-          <w:color w:val="1F2937"/>
-          <w:sz w:val="21"/>
-          <w:szCs w:val="21"/>
-        </w:rPr>
-        <w:t xml:space="preserve">→ Ya tienen un método que funciona pero no generan clientes de forma predecible.</w:t>
-      </w:r>
-    </w:p>
-    <w:p>
-      <w:pPr>
-        <w:spacing w:after="40"/>
-        <w:jc w:val="left"/>
-      </w:pPr>
-      <w:r>
-        <w:rPr>
-          <w:rFonts w:ascii="Calibri" w:cs="Calibri" w:eastAsia="Calibri" w:hAnsi="Calibri"/>
-          <w:b w:val="false"/>
-          <w:bCs w:val="false"/>
-          <w:i w:val="false"/>
-          <w:iCs w:val="false"/>
-          <w:color w:val="1F2937"/>
-          <w:sz w:val="21"/>
-          <w:szCs w:val="21"/>
-        </w:rPr>
-        <w:t xml:space="preserve">→ Quieren facturar $10K+/mes sin depender de referidos o redes sociales orgánicas.</w:t>
-      </w:r>
-    </w:p>
-    <w:p>
-      <w:pPr>
-        <w:spacing w:after="160"/>
-        <w:jc w:val="left"/>
-      </w:pPr>
-      <w:r>
-        <w:rPr>
-          <w:rFonts w:ascii="Calibri" w:cs="Calibri" w:eastAsia="Calibri" w:hAnsi="Calibri"/>
-          <w:b w:val="false"/>
-          <w:bCs w:val="false"/>
-          <w:i w:val="false"/>
-          <w:iCs w:val="false"/>
-          <w:color w:val="1F2937"/>
-          <w:sz w:val="21"/>
-          <w:szCs w:val="21"/>
-        </w:rPr>
-        <w:t xml:space="preserve">→ Están dispuestos a invertir en un sistema, no en otro curso.</w:t>
-      </w:r>
-    </w:p>
-    <w:p>
-      <w:pPr>
-        <w:spacing w:after="100"/>
-        <w:jc w:val="left"/>
-      </w:pPr>
-      <w:r>
-        <w:rPr>
-          <w:rFonts w:ascii="Calibri" w:cs="Calibri" w:eastAsia="Calibri" w:hAnsi="Calibri"/>
-          <w:b w:val="false"/>
-          <w:bCs w:val="false"/>
-          <w:i w:val="false"/>
-          <w:iCs w:val="false"/>
-          <w:color w:val="1F2937"/>
-          <w:sz w:val="21"/>
-          <w:szCs w:val="21"/>
-        </w:rPr>
-        <w:t xml:space="preserve">Si eso te describe, comenta "SISTEMA" o haz clic en el enlace para agendar una sesión de diagnóstico gratuita de 30 minutos donde analizamos tu situación y te damos un plan concreto.</w:t>
+        <w:t xml:space="preserve">Comenta "CLARIDAD" o haz clic en el enlace para una sesión de diagnóstico gratuita de 30 minutos. Analizamos tu situación y te damos un plan concreto.</w:t>
       </w:r>
     </w:p>
     <w:p>
@@ -4738,7 +4719,7 @@
           <w:sz w:val="21"/>
           <w:szCs w:val="21"/>
         </w:rPr>
-        <w:t xml:space="preserve">Sin compromiso. Si no es para ti, te lo decimos.</w:t>
+        <w:t xml:space="preserve">Si no es para ti, te lo decimos en los primeros 5 minutos.</w:t>
       </w:r>
     </w:p>
     <w:p>

</xml_diff>

<commit_message>
Rewrite both corrected ads in their original niche with inline annotations
- Ad 1: stays in personal development (Andrea, 34, professional on autopilot)
- Ad 2: stays in professional development (Diego, 38, stuck at middle management)
- Both now include blue bold-italic annotations showing which direct response
  principle each section of the copy solves (avatar, pain, mechanism, result, CTA)

Co-Authored-By: Claude Opus 4.6 <noreply@anthropic.com>
Claude-Session: https://claude.ai/code/session_01XyhqfmH114sHU8jizAj9nA
</commit_message>
<xml_diff>
--- a/BlueHackers_Evaluacion_Final_Marco.docx
+++ b/BlueHackers_Evaluacion_Final_Marco.docx
@@ -4434,7 +4434,26 @@
           <w:sz w:val="20"/>
           <w:szCs w:val="20"/>
         </w:rPr>
-        <w:t xml:space="preserve">A continuación, mi propuesta de reescritura aplicando los principios de respuesta directa:</w:t>
+        <w:t xml:space="preserve">Reescritura del anuncio aplicando los principios de respuesta directa. Las anotaciones en azul señalan qué principio resuelve cada parte:</w:t>
+      </w:r>
+    </w:p>
+    <w:p>
+      <w:pPr>
+        <w:spacing w:after="40"/>
+        <w:jc w:val="left"/>
+      </w:pPr>
+      <w:r>
+        <w:rPr>
+          <w:rFonts w:ascii="Calibri" w:cs="Calibri" w:eastAsia="Calibri" w:hAnsi="Calibri"/>
+          <w:b/>
+          <w:bCs/>
+          <w:i w:val="false"/>
+          <w:iCs w:val="false"/>
+          <w:color w:val="1F2937"/>
+          <w:sz w:val="21"/>
+          <w:szCs w:val="21"/>
+        </w:rPr>
+        <w:t xml:space="preserve">"Hace 4 meses me despertaba a las 3 AM con el pecho apretado, pensando en todo lo que no estaba funcionando en mi vida."</w:t>
       </w:r>
     </w:p>
     <w:p>
@@ -4447,13 +4466,32 @@
           <w:rFonts w:ascii="Calibri" w:cs="Calibri" w:eastAsia="Calibri" w:hAnsi="Calibri"/>
           <w:b/>
           <w:bCs/>
-          <w:i w:val="false"/>
-          <w:iCs w:val="false"/>
-          <w:color w:val="1F2937"/>
-          <w:sz w:val="21"/>
-          <w:szCs w:val="21"/>
-        </w:rPr>
-        <w:t xml:space="preserve">"Hace 4 meses me despertaba a las 3 AM con el pecho apretado, pensando en todo lo que no estaba funcionando en mi vida."</w:t>
+          <w:i/>
+          <w:iCs/>
+          <w:color w:val="334470"/>
+          <w:sz w:val="19"/>
+          <w:szCs w:val="19"/>
+        </w:rPr>
+        <w:t xml:space="preserve">→ Hook con pattern interrupt: abre con emoción y situación concreta, no con pregunta genérica.</w:t>
+      </w:r>
+    </w:p>
+    <w:p>
+      <w:pPr>
+        <w:spacing w:after="40"/>
+        <w:jc w:val="left"/>
+      </w:pPr>
+      <w:r>
+        <w:rPr>
+          <w:rFonts w:ascii="Calibri" w:cs="Calibri" w:eastAsia="Calibri" w:hAnsi="Calibri"/>
+          <w:b w:val="false"/>
+          <w:bCs w:val="false"/>
+          <w:i w:val="false"/>
+          <w:iCs w:val="false"/>
+          <w:color w:val="1F2937"/>
+          <w:sz w:val="21"/>
+          <w:szCs w:val="21"/>
+        </w:rPr>
+        <w:t xml:space="preserve">Andrea tiene 34 años.</w:t>
       </w:r>
     </w:p>
     <w:p>
@@ -4464,15 +4502,34 @@
       <w:r>
         <w:rPr>
           <w:rFonts w:ascii="Calibri" w:cs="Calibri" w:eastAsia="Calibri" w:hAnsi="Calibri"/>
-          <w:b w:val="false"/>
-          <w:bCs w:val="false"/>
-          <w:i w:val="false"/>
-          <w:iCs w:val="false"/>
-          <w:color w:val="1F2937"/>
-          <w:sz w:val="21"/>
-          <w:szCs w:val="21"/>
-        </w:rPr>
-        <w:t xml:space="preserve">Andrea tiene 34 años. Desde fuera parecía que estaba bien: trabajo estable, pareja, rutina. Pero por dentro sentía que estaba en piloto automático. Sin energía. Sin dirección. Cada domingo en la noche, la misma angustia de empezar otra semana exactamente igual.</w:t>
+          <w:b/>
+          <w:bCs/>
+          <w:i/>
+          <w:iCs/>
+          <w:color w:val="334470"/>
+          <w:sz w:val="19"/>
+          <w:szCs w:val="19"/>
+        </w:rPr>
+        <w:t xml:space="preserve">→ Avatar definido: nombre, edad, perfil específico.</w:t>
+      </w:r>
+    </w:p>
+    <w:p>
+      <w:pPr>
+        <w:spacing w:after="40"/>
+        <w:jc w:val="left"/>
+      </w:pPr>
+      <w:r>
+        <w:rPr>
+          <w:rFonts w:ascii="Calibri" w:cs="Calibri" w:eastAsia="Calibri" w:hAnsi="Calibri"/>
+          <w:b w:val="false"/>
+          <w:bCs w:val="false"/>
+          <w:i w:val="false"/>
+          <w:iCs w:val="false"/>
+          <w:color w:val="1F2937"/>
+          <w:sz w:val="21"/>
+          <w:szCs w:val="21"/>
+        </w:rPr>
+        <w:t xml:space="preserve">Desde fuera parecía que estaba bien: trabajo estable, pareja, rutina. Pero por dentro sentía que estaba en piloto automático. Sin energía. Sin dirección. Cada domingo en la noche, la misma angustia de empezar otra semana exactamente igual.</w:t>
       </w:r>
     </w:p>
     <w:p>
@@ -4483,6 +4540,25 @@
       <w:r>
         <w:rPr>
           <w:rFonts w:ascii="Calibri" w:cs="Calibri" w:eastAsia="Calibri" w:hAnsi="Calibri"/>
+          <w:b/>
+          <w:bCs/>
+          <w:i/>
+          <w:iCs/>
+          <w:color w:val="334470"/>
+          <w:sz w:val="19"/>
+          <w:szCs w:val="19"/>
+        </w:rPr>
+        <w:t xml:space="preserve">→ Dolor específico y profundo: no es "quiero mejorar", es una escena que el lector siente.</w:t>
+      </w:r>
+    </w:p>
+    <w:p>
+      <w:pPr>
+        <w:spacing w:after="40"/>
+        <w:jc w:val="left"/>
+      </w:pPr>
+      <w:r>
+        <w:rPr>
+          <w:rFonts w:ascii="Calibri" w:cs="Calibri" w:eastAsia="Calibri" w:hAnsi="Calibri"/>
           <w:b w:val="false"/>
           <w:bCs w:val="false"/>
           <w:i w:val="false"/>
@@ -4496,21 +4572,78 @@
     </w:p>
     <w:p>
       <w:pPr>
+        <w:spacing w:after="100"/>
+        <w:jc w:val="left"/>
+      </w:pPr>
+      <w:r>
+        <w:rPr>
+          <w:rFonts w:ascii="Calibri" w:cs="Calibri" w:eastAsia="Calibri" w:hAnsi="Calibri"/>
+          <w:b/>
+          <w:bCs/>
+          <w:i/>
+          <w:iCs/>
+          <w:color w:val="334470"/>
+          <w:sz w:val="19"/>
+          <w:szCs w:val="19"/>
+        </w:rPr>
+        <w:t xml:space="preserve">→ Descarta soluciones previas: posiciona el programa como diferente a lo que ya intentó.</w:t>
+      </w:r>
+    </w:p>
+    <w:p>
+      <w:pPr>
+        <w:spacing w:after="40"/>
+        <w:jc w:val="left"/>
+      </w:pPr>
+      <w:r>
+        <w:rPr>
+          <w:rFonts w:ascii="Calibri" w:cs="Calibri" w:eastAsia="Calibri" w:hAnsi="Calibri"/>
+          <w:b w:val="false"/>
+          <w:bCs w:val="false"/>
+          <w:i w:val="false"/>
+          <w:iCs w:val="false"/>
+          <w:color w:val="1F2937"/>
+          <w:sz w:val="21"/>
+          <w:szCs w:val="21"/>
+        </w:rPr>
+        <w:t xml:space="preserve">Su problema no era falta de motivación. Era que no tenía un sistema real de cambio con alguien que la acompañara y le exigiera.</w:t>
+      </w:r>
+    </w:p>
+    <w:p>
+      <w:pPr>
         <w:spacing w:after="160"/>
         <w:jc w:val="left"/>
       </w:pPr>
       <w:r>
         <w:rPr>
           <w:rFonts w:ascii="Calibri" w:cs="Calibri" w:eastAsia="Calibri" w:hAnsi="Calibri"/>
-          <w:b w:val="false"/>
-          <w:bCs w:val="false"/>
-          <w:i w:val="false"/>
-          <w:iCs w:val="false"/>
-          <w:color w:val="1F2937"/>
-          <w:sz w:val="21"/>
-          <w:szCs w:val="21"/>
-        </w:rPr>
-        <w:t xml:space="preserve">Su problema no era falta de motivación. Era que no tenía un sistema real de cambio con alguien que la acompañara y le exigiera.</w:t>
+          <w:b/>
+          <w:bCs/>
+          <w:i/>
+          <w:iCs/>
+          <w:color w:val="334470"/>
+          <w:sz w:val="19"/>
+          <w:szCs w:val="19"/>
+        </w:rPr>
+        <w:t xml:space="preserve">→ Reframe del problema: cambia la creencia del lector y abre la puerta al mecanismo.</w:t>
+      </w:r>
+    </w:p>
+    <w:p>
+      <w:pPr>
+        <w:spacing w:after="40"/>
+        <w:jc w:val="left"/>
+      </w:pPr>
+      <w:r>
+        <w:rPr>
+          <w:rFonts w:ascii="Calibri" w:cs="Calibri" w:eastAsia="Calibri" w:hAnsi="Calibri"/>
+          <w:b/>
+          <w:bCs/>
+          <w:i w:val="false"/>
+          <w:iCs w:val="false"/>
+          <w:color w:val="1F2937"/>
+          <w:sz w:val="21"/>
+          <w:szCs w:val="21"/>
+        </w:rPr>
+        <w:t xml:space="preserve">En 90 días trabajamos en 3 áreas:</w:t>
       </w:r>
     </w:p>
     <w:p>
@@ -4523,13 +4656,13 @@
           <w:rFonts w:ascii="Calibri" w:cs="Calibri" w:eastAsia="Calibri" w:hAnsi="Calibri"/>
           <w:b/>
           <w:bCs/>
-          <w:i w:val="false"/>
-          <w:iCs w:val="false"/>
-          <w:color w:val="1F2937"/>
-          <w:sz w:val="21"/>
-          <w:szCs w:val="21"/>
-        </w:rPr>
-        <w:t xml:space="preserve">En 90 días trabajamos en 3 áreas:</w:t>
+          <w:i/>
+          <w:iCs/>
+          <w:color w:val="334470"/>
+          <w:sz w:val="19"/>
+          <w:szCs w:val="19"/>
+        </w:rPr>
+        <w:t xml:space="preserve">→ Mecanismo claro con timeframe: dice exactamente qué se hizo y en cuánto tiempo.</w:t>
       </w:r>
     </w:p>
     <w:p>
@@ -4591,6 +4724,25 @@
     </w:p>
     <w:p>
       <w:pPr>
+        <w:spacing w:after="40"/>
+        <w:jc w:val="left"/>
+      </w:pPr>
+      <w:r>
+        <w:rPr>
+          <w:rFonts w:ascii="Calibri" w:cs="Calibri" w:eastAsia="Calibri" w:hAnsi="Calibri"/>
+          <w:b/>
+          <w:bCs/>
+          <w:i w:val="false"/>
+          <w:iCs w:val="false"/>
+          <w:color w:val="166534"/>
+          <w:sz w:val="21"/>
+          <w:szCs w:val="21"/>
+        </w:rPr>
+        <w:t xml:space="preserve">Resultado: dejó un trabajo que la hacía infeliz, negoció una posición con 40% más de salario en algo que le importa, y por primera vez en 3 años duerme sin pastillas.</w:t>
+      </w:r>
+    </w:p>
+    <w:p>
+      <w:pPr>
         <w:spacing w:after="160"/>
         <w:jc w:val="left"/>
       </w:pPr>
@@ -4599,13 +4751,13 @@
           <w:rFonts w:ascii="Calibri" w:cs="Calibri" w:eastAsia="Calibri" w:hAnsi="Calibri"/>
           <w:b/>
           <w:bCs/>
-          <w:i w:val="false"/>
-          <w:iCs w:val="false"/>
-          <w:color w:val="166534"/>
-          <w:sz w:val="21"/>
-          <w:szCs w:val="21"/>
-        </w:rPr>
-        <w:t xml:space="preserve">Resultado: dejó un trabajo que la hacía infeliz, negoció una posición con 40% más de salario en algo que le importa, y por primera vez en 3 años duerme sin pastillas.</w:t>
+          <w:i/>
+          <w:iCs/>
+          <w:color w:val="334470"/>
+          <w:sz w:val="19"/>
+          <w:szCs w:val="19"/>
+        </w:rPr>
+        <w:t xml:space="preserve">→ Resultado medible con prueba social real: números concretos (+40%, 3 años, 90 días), no "miles de personas".</w:t>
       </w:r>
     </w:p>
     <w:p>
@@ -4667,7 +4819,7 @@
     </w:p>
     <w:p>
       <w:pPr>
-        <w:spacing w:after="160"/>
+        <w:spacing w:after="40"/>
         <w:jc w:val="left"/>
       </w:pPr>
       <w:r>
@@ -4687,6 +4839,25 @@
     <w:p>
       <w:pPr>
         <w:spacing w:after="100"/>
+        <w:jc w:val="left"/>
+      </w:pPr>
+      <w:r>
+        <w:rPr>
+          <w:rFonts w:ascii="Calibri" w:cs="Calibri" w:eastAsia="Calibri" w:hAnsi="Calibri"/>
+          <w:b/>
+          <w:bCs/>
+          <w:i/>
+          <w:iCs/>
+          <w:color w:val="334470"/>
+          <w:sz w:val="19"/>
+          <w:szCs w:val="19"/>
+        </w:rPr>
+        <w:t xml:space="preserve">→ CTA con urgencia concreta: número limitado de espacios + filtro de avatar para que solo aplique quien califica.</w:t>
+      </w:r>
+    </w:p>
+    <w:p>
+      <w:pPr>
+        <w:spacing w:after="40"/>
         <w:jc w:val="left"/>
       </w:pPr>
       <w:r>
@@ -5117,7 +5288,26 @@
           <w:sz w:val="20"/>
           <w:szCs w:val="20"/>
         </w:rPr>
-        <w:t xml:space="preserve">Reescritura aplicando: un avatar, un problema, un resultado con prueba social:</w:t>
+        <w:t xml:space="preserve">El anuncio original listaba 6 módulos como un catálogo. La corrección elige UN avatar con UN problema del desarrollo profesional y construye el anuncio alrededor de su resultado:</w:t>
+      </w:r>
+    </w:p>
+    <w:p>
+      <w:pPr>
+        <w:spacing w:after="40"/>
+        <w:jc w:val="left"/>
+      </w:pPr>
+      <w:r>
+        <w:rPr>
+          <w:rFonts w:ascii="Calibri" w:cs="Calibri" w:eastAsia="Calibri" w:hAnsi="Calibri"/>
+          <w:b/>
+          <w:bCs/>
+          <w:i w:val="false"/>
+          <w:iCs w:val="false"/>
+          <w:color w:val="1F2937"/>
+          <w:sz w:val="21"/>
+          <w:szCs w:val="21"/>
+        </w:rPr>
+        <w:t xml:space="preserve">"Mi jefe me dijo que no estaba listo para el ascenso. Llevaba 5 años esperándolo."</w:t>
       </w:r>
     </w:p>
     <w:p>
@@ -5130,13 +5320,32 @@
           <w:rFonts w:ascii="Calibri" w:cs="Calibri" w:eastAsia="Calibri" w:hAnsi="Calibri"/>
           <w:b/>
           <w:bCs/>
-          <w:i w:val="false"/>
-          <w:iCs w:val="false"/>
-          <w:color w:val="1F2937"/>
-          <w:sz w:val="21"/>
-          <w:szCs w:val="21"/>
-        </w:rPr>
-        <w:t xml:space="preserve">"Trabajaba 14 horas al día, no dormía y estaba a punto de renunciar a mi propia empresa."</w:t>
+          <w:i/>
+          <w:iCs/>
+          <w:color w:val="334470"/>
+          <w:sz w:val="19"/>
+          <w:szCs w:val="19"/>
+        </w:rPr>
+        <w:t xml:space="preserve">→ Hook con pattern interrupt: situación dolorosa y concreta que el avatar reconoce al instante.</w:t>
+      </w:r>
+    </w:p>
+    <w:p>
+      <w:pPr>
+        <w:spacing w:after="40"/>
+        <w:jc w:val="left"/>
+      </w:pPr>
+      <w:r>
+        <w:rPr>
+          <w:rFonts w:ascii="Calibri" w:cs="Calibri" w:eastAsia="Calibri" w:hAnsi="Calibri"/>
+          <w:b w:val="false"/>
+          <w:bCs w:val="false"/>
+          <w:i w:val="false"/>
+          <w:iCs w:val="false"/>
+          <w:color w:val="1F2937"/>
+          <w:sz w:val="21"/>
+          <w:szCs w:val="21"/>
+        </w:rPr>
+        <w:t xml:space="preserve">Diego tiene 38 años, es gerente medio en una empresa de tecnología. Competente en lo técnico, pero cada vez que se abría una posición de director, se la daban a otro.</w:t>
       </w:r>
     </w:p>
     <w:p>
@@ -5147,15 +5356,34 @@
       <w:r>
         <w:rPr>
           <w:rFonts w:ascii="Calibri" w:cs="Calibri" w:eastAsia="Calibri" w:hAnsi="Calibri"/>
-          <w:b w:val="false"/>
-          <w:bCs w:val="false"/>
-          <w:i w:val="false"/>
-          <w:iCs w:val="false"/>
-          <w:color w:val="1F2937"/>
-          <w:sz w:val="21"/>
-          <w:szCs w:val="21"/>
-        </w:rPr>
-        <w:t xml:space="preserve">Carlos tiene una agencia de marketing con 12 empleados. Desde fuera, todo iba bien: facturación creciendo, equipo completo, clientes contentos.</w:t>
+          <w:b/>
+          <w:bCs/>
+          <w:i/>
+          <w:iCs/>
+          <w:color w:val="334470"/>
+          <w:sz w:val="19"/>
+          <w:szCs w:val="19"/>
+        </w:rPr>
+        <w:t xml:space="preserve">→ Avatar definido: nombre, edad, cargo, situación profesional concreta.</w:t>
+      </w:r>
+    </w:p>
+    <w:p>
+      <w:pPr>
+        <w:spacing w:after="40"/>
+        <w:jc w:val="left"/>
+      </w:pPr>
+      <w:r>
+        <w:rPr>
+          <w:rFonts w:ascii="Calibri" w:cs="Calibri" w:eastAsia="Calibri" w:hAnsi="Calibri"/>
+          <w:b w:val="false"/>
+          <w:bCs w:val="false"/>
+          <w:i w:val="false"/>
+          <w:iCs w:val="false"/>
+          <w:color w:val="1F2937"/>
+          <w:sz w:val="21"/>
+          <w:szCs w:val="21"/>
+        </w:rPr>
+        <w:t xml:space="preserve">El feedback siempre era el mismo: "Te falta presencia", "Necesitas comunicar mejor", "No inspiras suficiente confianza". Pero nadie le decía exactamente cómo arreglarlo.</w:t>
       </w:r>
     </w:p>
     <w:p>
@@ -5166,15 +5394,72 @@
       <w:r>
         <w:rPr>
           <w:rFonts w:ascii="Calibri" w:cs="Calibri" w:eastAsia="Calibri" w:hAnsi="Calibri"/>
-          <w:b w:val="false"/>
-          <w:bCs w:val="false"/>
-          <w:i w:val="false"/>
-          <w:iCs w:val="false"/>
-          <w:color w:val="1F2937"/>
-          <w:sz w:val="21"/>
-          <w:szCs w:val="21"/>
-        </w:rPr>
-        <w:t xml:space="preserve">Desde dentro, era un desastre. Cada decisión pasaba por él. Apagaba fuegos 14 horas al día. No podía irse de vacaciones sin que algo explotara.</w:t>
+          <w:b/>
+          <w:bCs/>
+          <w:i/>
+          <w:iCs/>
+          <w:color w:val="334470"/>
+          <w:sz w:val="19"/>
+          <w:szCs w:val="19"/>
+        </w:rPr>
+        <w:t xml:space="preserve">→ Dolor específico y profundo: no es "quiero desarrollo profesional", es la frustración exacta que siente.</w:t>
+      </w:r>
+    </w:p>
+    <w:p>
+      <w:pPr>
+        <w:spacing w:after="40"/>
+        <w:jc w:val="left"/>
+      </w:pPr>
+      <w:r>
+        <w:rPr>
+          <w:rFonts w:ascii="Calibri" w:cs="Calibri" w:eastAsia="Calibri" w:hAnsi="Calibri"/>
+          <w:b w:val="false"/>
+          <w:bCs w:val="false"/>
+          <w:i w:val="false"/>
+          <w:iCs w:val="false"/>
+          <w:color w:val="1F2937"/>
+          <w:sz w:val="21"/>
+          <w:szCs w:val="21"/>
+        </w:rPr>
+        <w:t xml:space="preserve">Ya había leído libros de liderazgo, tomado cursos de productividad, y hasta un taller de inteligencia emocional. Sabía la teoría, pero nada cambiaba en la sala de reuniones.</w:t>
+      </w:r>
+    </w:p>
+    <w:p>
+      <w:pPr>
+        <w:spacing w:after="100"/>
+        <w:jc w:val="left"/>
+      </w:pPr>
+      <w:r>
+        <w:rPr>
+          <w:rFonts w:ascii="Calibri" w:cs="Calibri" w:eastAsia="Calibri" w:hAnsi="Calibri"/>
+          <w:b/>
+          <w:bCs/>
+          <w:i/>
+          <w:iCs/>
+          <w:color w:val="334470"/>
+          <w:sz w:val="19"/>
+          <w:szCs w:val="19"/>
+        </w:rPr>
+        <w:t xml:space="preserve">→ Descarta soluciones previas: los módulos que el anuncio original listaba como features aquí son lo que YA FALLÓ.</w:t>
+      </w:r>
+    </w:p>
+    <w:p>
+      <w:pPr>
+        <w:spacing w:after="40"/>
+        <w:jc w:val="left"/>
+      </w:pPr>
+      <w:r>
+        <w:rPr>
+          <w:rFonts w:ascii="Calibri" w:cs="Calibri" w:eastAsia="Calibri" w:hAnsi="Calibri"/>
+          <w:b w:val="false"/>
+          <w:bCs w:val="false"/>
+          <w:i w:val="false"/>
+          <w:iCs w:val="false"/>
+          <w:color w:val="1F2937"/>
+          <w:sz w:val="21"/>
+          <w:szCs w:val="21"/>
+        </w:rPr>
+        <w:t xml:space="preserve">Su problema no era conocimiento. Era que nadie le había dado práctica real con feedback directo en las situaciones donde se jugaba el puesto.</w:t>
       </w:r>
     </w:p>
     <w:p>
@@ -5185,15 +5470,34 @@
       <w:r>
         <w:rPr>
           <w:rFonts w:ascii="Calibri" w:cs="Calibri" w:eastAsia="Calibri" w:hAnsi="Calibri"/>
-          <w:b w:val="false"/>
-          <w:bCs w:val="false"/>
-          <w:i w:val="false"/>
-          <w:iCs w:val="false"/>
-          <w:color w:val="1F2937"/>
-          <w:sz w:val="21"/>
-          <w:szCs w:val="21"/>
-        </w:rPr>
-        <w:t xml:space="preserve">Tenía un negocio que funcionaba, pero solo si él estaba encima de todo. No era un CEO — era el empleado más caro de su propia empresa.</w:t>
+          <w:b/>
+          <w:bCs/>
+          <w:i/>
+          <w:iCs/>
+          <w:color w:val="334470"/>
+          <w:sz w:val="19"/>
+          <w:szCs w:val="19"/>
+        </w:rPr>
+        <w:t xml:space="preserve">→ Reframe: cambia "necesito más cursos" por "necesito práctica real con acompañamiento".</w:t>
+      </w:r>
+    </w:p>
+    <w:p>
+      <w:pPr>
+        <w:spacing w:after="40"/>
+        <w:jc w:val="left"/>
+      </w:pPr>
+      <w:r>
+        <w:rPr>
+          <w:rFonts w:ascii="Calibri" w:cs="Calibri" w:eastAsia="Calibri" w:hAnsi="Calibri"/>
+          <w:b/>
+          <w:bCs/>
+          <w:i w:val="false"/>
+          <w:iCs w:val="false"/>
+          <w:color w:val="1F2937"/>
+          <w:sz w:val="21"/>
+          <w:szCs w:val="21"/>
+        </w:rPr>
+        <w:t xml:space="preserve">En 12 semanas trabajamos en 3 cosas:</w:t>
       </w:r>
     </w:p>
     <w:p>
@@ -5206,13 +5510,13 @@
           <w:rFonts w:ascii="Calibri" w:cs="Calibri" w:eastAsia="Calibri" w:hAnsi="Calibri"/>
           <w:b/>
           <w:bCs/>
-          <w:i w:val="false"/>
-          <w:iCs w:val="false"/>
-          <w:color w:val="1F2937"/>
-          <w:sz w:val="21"/>
-          <w:szCs w:val="21"/>
-        </w:rPr>
-        <w:t xml:space="preserve">En 8 semanas cambiamos 3 cosas:</w:t>
+          <w:i/>
+          <w:iCs/>
+          <w:color w:val="334470"/>
+          <w:sz w:val="19"/>
+          <w:szCs w:val="19"/>
+        </w:rPr>
+        <w:t xml:space="preserve">→ Mecanismo claro con timeframe: qué se hizo, cuánto tiempo, estructura concreta.</w:t>
       </w:r>
     </w:p>
     <w:p>
@@ -5231,7 +5535,7 @@
           <w:sz w:val="21"/>
           <w:szCs w:val="21"/>
         </w:rPr>
-        <w:t xml:space="preserve">1. Delegó el 60% de las decisiones operativas con un framework de autonomía por niveles.</w:t>
+        <w:t xml:space="preserve">1. Simulaciones semanales de reuniones de liderazgo con feedback grabado — vio exactamente qué proyectaba y qué corregir.</w:t>
       </w:r>
     </w:p>
     <w:p>
@@ -5250,7 +5554,7 @@
           <w:sz w:val="21"/>
           <w:szCs w:val="21"/>
         </w:rPr>
-        <w:t xml:space="preserve">2. Instaló un sistema de toma de decisiones que su equipo usa sin consultarle.</w:t>
+        <w:t xml:space="preserve">2. Un sistema de comunicación ejecutiva que usó en cada presentación, negociación y conversación difícil.</w:t>
       </w:r>
     </w:p>
     <w:p>
@@ -5269,7 +5573,26 @@
           <w:sz w:val="21"/>
           <w:szCs w:val="21"/>
         </w:rPr>
-        <w:t xml:space="preserve">3. Recuperó sus noches, sus fines de semana y su relación de pareja.</w:t>
+        <w:t xml:space="preserve">3. Sesiones 1-a-1 de accountability con un mentor que ya pasó por ese mismo techo de cristal.</w:t>
+      </w:r>
+    </w:p>
+    <w:p>
+      <w:pPr>
+        <w:spacing w:after="40"/>
+        <w:jc w:val="left"/>
+      </w:pPr>
+      <w:r>
+        <w:rPr>
+          <w:rFonts w:ascii="Calibri" w:cs="Calibri" w:eastAsia="Calibri" w:hAnsi="Calibri"/>
+          <w:b/>
+          <w:bCs/>
+          <w:i w:val="false"/>
+          <w:iCs w:val="false"/>
+          <w:color w:val="166534"/>
+          <w:sz w:val="21"/>
+          <w:szCs w:val="21"/>
+        </w:rPr>
+        <w:t xml:space="preserve">Resultado: en la semana 10, Diego presentó ante el comité directivo. Un mes después lo promovieron a Director de Operaciones con un aumento del 55%.</w:t>
       </w:r>
     </w:p>
     <w:p>
@@ -5282,13 +5605,89 @@
           <w:rFonts w:ascii="Calibri" w:cs="Calibri" w:eastAsia="Calibri" w:hAnsi="Calibri"/>
           <w:b/>
           <w:bCs/>
-          <w:i w:val="false"/>
-          <w:iCs w:val="false"/>
-          <w:color w:val="166534"/>
-          <w:sz w:val="21"/>
-          <w:szCs w:val="21"/>
-        </w:rPr>
-        <w:t xml:space="preserve">Hoy factura lo mismo, trabaja 6 horas al día y su equipo rinde mejor que cuando él controlaba todo.</w:t>
+          <w:i/>
+          <w:iCs/>
+          <w:color w:val="334470"/>
+          <w:sz w:val="19"/>
+          <w:szCs w:val="19"/>
+        </w:rPr>
+        <w:t xml:space="preserve">→ Resultado medible con prueba social real: cargo específico, porcentaje exacto, timeline concreto. No "transformación total".</w:t>
+      </w:r>
+    </w:p>
+    <w:p>
+      <w:pPr>
+        <w:spacing w:after="80"/>
+        <w:jc w:val="left"/>
+      </w:pPr>
+      <w:r>
+        <w:rPr>
+          <w:rFonts w:ascii="Calibri" w:cs="Calibri" w:eastAsia="Calibri" w:hAnsi="Calibri"/>
+          <w:b/>
+          <w:bCs/>
+          <w:i w:val="false"/>
+          <w:iCs w:val="false"/>
+          <w:color w:val="1F2937"/>
+          <w:sz w:val="21"/>
+          <w:szCs w:val="21"/>
+        </w:rPr>
+        <w:t xml:space="preserve">Este mes abrimos 4 espacios para profesionales que:</w:t>
+      </w:r>
+    </w:p>
+    <w:p>
+      <w:pPr>
+        <w:spacing w:after="40"/>
+        <w:jc w:val="left"/>
+      </w:pPr>
+      <w:r>
+        <w:rPr>
+          <w:rFonts w:ascii="Calibri" w:cs="Calibri" w:eastAsia="Calibri" w:hAnsi="Calibri"/>
+          <w:b w:val="false"/>
+          <w:bCs w:val="false"/>
+          <w:i w:val="false"/>
+          <w:iCs w:val="false"/>
+          <w:color w:val="1F2937"/>
+          <w:sz w:val="21"/>
+          <w:szCs w:val="21"/>
+        </w:rPr>
+        <w:t xml:space="preserve">→ Llevan 2+ años estancados en el mismo nivel.</w:t>
+      </w:r>
+    </w:p>
+    <w:p>
+      <w:pPr>
+        <w:spacing w:after="40"/>
+        <w:jc w:val="left"/>
+      </w:pPr>
+      <w:r>
+        <w:rPr>
+          <w:rFonts w:ascii="Calibri" w:cs="Calibri" w:eastAsia="Calibri" w:hAnsi="Calibri"/>
+          <w:b w:val="false"/>
+          <w:bCs w:val="false"/>
+          <w:i w:val="false"/>
+          <w:iCs w:val="false"/>
+          <w:color w:val="1F2937"/>
+          <w:sz w:val="21"/>
+          <w:szCs w:val="21"/>
+        </w:rPr>
+        <w:t xml:space="preserve">→ Saben que el problema no es técnico sino de cómo se perciben.</w:t>
+      </w:r>
+    </w:p>
+    <w:p>
+      <w:pPr>
+        <w:spacing w:after="40"/>
+        <w:jc w:val="left"/>
+      </w:pPr>
+      <w:r>
+        <w:rPr>
+          <w:rFonts w:ascii="Calibri" w:cs="Calibri" w:eastAsia="Calibri" w:hAnsi="Calibri"/>
+          <w:b w:val="false"/>
+          <w:bCs w:val="false"/>
+          <w:i w:val="false"/>
+          <w:iCs w:val="false"/>
+          <w:color w:val="1F2937"/>
+          <w:sz w:val="21"/>
+          <w:szCs w:val="21"/>
+        </w:rPr>
+        <w:t xml:space="preserve">→ Están listos para invertir 12 semanas en romper ese techo.</w:t>
       </w:r>
     </w:p>
     <w:p>
@@ -5301,32 +5700,32 @@
           <w:rFonts w:ascii="Calibri" w:cs="Calibri" w:eastAsia="Calibri" w:hAnsi="Calibri"/>
           <w:b/>
           <w:bCs/>
-          <w:i w:val="false"/>
-          <w:iCs w:val="false"/>
-          <w:color w:val="1F2937"/>
-          <w:sz w:val="21"/>
-          <w:szCs w:val="21"/>
-        </w:rPr>
-        <w:t xml:space="preserve">Si tienes un negocio que funciona pero te consume la vida, esto es para ti.</w:t>
-      </w:r>
-    </w:p>
-    <w:p>
-      <w:pPr>
-        <w:spacing w:after="160"/>
-        <w:jc w:val="left"/>
-      </w:pPr>
-      <w:r>
-        <w:rPr>
-          <w:rFonts w:ascii="Calibri" w:cs="Calibri" w:eastAsia="Calibri" w:hAnsi="Calibri"/>
-          <w:b w:val="false"/>
-          <w:bCs w:val="false"/>
-          <w:i w:val="false"/>
-          <w:iCs w:val="false"/>
-          <w:color w:val="1F2937"/>
-          <w:sz w:val="21"/>
-          <w:szCs w:val="21"/>
-        </w:rPr>
-        <w:t xml:space="preserve">No es otro curso de liderazgo. Es un proceso de 8 semanas donde reestructuramos cómo opera tu negocio para que deje de depender de ti para respirar.</w:t>
+          <w:i/>
+          <w:iCs/>
+          <w:color w:val="334470"/>
+          <w:sz w:val="19"/>
+          <w:szCs w:val="19"/>
+        </w:rPr>
+        <w:t xml:space="preserve">→ CTA con urgencia concreta: espacios limitados + filtro de perfil que atrae solo al avatar correcto.</w:t>
+      </w:r>
+    </w:p>
+    <w:p>
+      <w:pPr>
+        <w:spacing w:after="40"/>
+        <w:jc w:val="left"/>
+      </w:pPr>
+      <w:r>
+        <w:rPr>
+          <w:rFonts w:ascii="Calibri" w:cs="Calibri" w:eastAsia="Calibri" w:hAnsi="Calibri"/>
+          <w:b w:val="false"/>
+          <w:bCs w:val="false"/>
+          <w:i w:val="false"/>
+          <w:iCs w:val="false"/>
+          <w:color w:val="1F2937"/>
+          <w:sz w:val="21"/>
+          <w:szCs w:val="21"/>
+        </w:rPr>
+        <w:t xml:space="preserve">Comenta "ASCENSO" o haz clic para agendar una sesión de diagnóstico gratuita de 30 min donde analizamos qué te frena y te damos un plan.</w:t>
       </w:r>
     </w:p>
     <w:p>
@@ -5339,32 +5738,13 @@
           <w:rFonts w:ascii="Calibri" w:cs="Calibri" w:eastAsia="Calibri" w:hAnsi="Calibri"/>
           <w:b w:val="false"/>
           <w:bCs w:val="false"/>
-          <w:i w:val="false"/>
-          <w:iCs w:val="false"/>
-          <w:color w:val="1F2937"/>
-          <w:sz w:val="21"/>
-          <w:szCs w:val="21"/>
-        </w:rPr>
-        <w:t xml:space="preserve">Abrimos 5 espacios este mes para dueños de negocio que facturen $15K+/mes y quieran dejar de ser el cuello de botella.</w:t>
-      </w:r>
-    </w:p>
-    <w:p>
-      <w:pPr>
-        <w:spacing w:after="100"/>
-        <w:jc w:val="left"/>
-      </w:pPr>
-      <w:r>
-        <w:rPr>
-          <w:rFonts w:ascii="Calibri" w:cs="Calibri" w:eastAsia="Calibri" w:hAnsi="Calibri"/>
-          <w:b w:val="false"/>
-          <w:bCs w:val="false"/>
-          <w:i w:val="false"/>
-          <w:iCs w:val="false"/>
-          <w:color w:val="1F2937"/>
-          <w:sz w:val="21"/>
-          <w:szCs w:val="21"/>
-        </w:rPr>
-        <w:t xml:space="preserve">Haz clic abajo para agendar un diagnóstico gratuito de 30 min. Si no aplica para ti, te lo decimos en los primeros 5 minutos.</w:t>
+          <w:i/>
+          <w:iCs/>
+          <w:color w:val="1F2937"/>
+          <w:sz w:val="21"/>
+          <w:szCs w:val="21"/>
+        </w:rPr>
+        <w:t xml:space="preserve">Si no es para ti, te lo decimos. Sin compromiso.</w:t>
       </w:r>
     </w:p>
     <w:sectPr>

</xml_diff>